<commit_message>
Update Resume in PDF format
</commit_message>
<xml_diff>
--- a/docs/assets/files/shiva-naik-cv.docx
+++ b/docs/assets/files/shiva-naik-cv.docx
@@ -749,7 +749,39 @@
                 <w:color w:val="000000"/>
                 <w:sz w:val="18"/>
               </w:rPr>
-              <w:t>github.com/shivaops</w:t>
+              <w:t>github.com/</w:t>
+            </w:r>
+            <w:r>
+              <w:rPr>
+                <w:rFonts w:ascii="Segoe UI" w:eastAsia="Segoe UI" w:hAnsi="Segoe UI" w:cs="Segoe UI"/>
+                <w:color w:val="000000"/>
+                <w:sz w:val="18"/>
+              </w:rPr>
+              <w:t>S</w:t>
+            </w:r>
+            <w:r>
+              <w:rPr>
+                <w:rFonts w:ascii="Segoe UI" w:eastAsia="Segoe UI" w:hAnsi="Segoe UI" w:cs="Segoe UI"/>
+                <w:color w:val="000000"/>
+                <w:sz w:val="18"/>
+              </w:rPr>
+              <w:t>hiva</w:t>
+            </w:r>
+            <w:r>
+              <w:rPr>
+                <w:rFonts w:ascii="Segoe UI" w:eastAsia="Segoe UI" w:hAnsi="Segoe UI" w:cs="Segoe UI"/>
+                <w:color w:val="000000"/>
+                <w:sz w:val="18"/>
+              </w:rPr>
+              <w:t>O</w:t>
+            </w:r>
+            <w:r>
+              <w:rPr>
+                <w:rFonts w:ascii="Segoe UI" w:eastAsia="Segoe UI" w:hAnsi="Segoe UI" w:cs="Segoe UI"/>
+                <w:color w:val="000000"/>
+                <w:sz w:val="18"/>
+              </w:rPr>
+              <w:t>ps</w:t>
             </w:r>
           </w:p>
           <w:p>
@@ -839,7 +871,31 @@
                 <w:color w:val="000000"/>
                 <w:sz w:val="18"/>
               </w:rPr>
-              <w:t>shivaops.github.io</w:t>
+              <w:t>S</w:t>
+            </w:r>
+            <w:r>
+              <w:rPr>
+                <w:rFonts w:ascii="Segoe UI" w:eastAsia="Segoe UI" w:hAnsi="Segoe UI" w:cs="Segoe UI"/>
+                <w:color w:val="000000"/>
+                <w:sz w:val="18"/>
+              </w:rPr>
+              <w:t>hiva</w:t>
+            </w:r>
+            <w:r>
+              <w:rPr>
+                <w:rFonts w:ascii="Segoe UI" w:eastAsia="Segoe UI" w:hAnsi="Segoe UI" w:cs="Segoe UI"/>
+                <w:color w:val="000000"/>
+                <w:sz w:val="18"/>
+              </w:rPr>
+              <w:t>O</w:t>
+            </w:r>
+            <w:r>
+              <w:rPr>
+                <w:rFonts w:ascii="Segoe UI" w:eastAsia="Segoe UI" w:hAnsi="Segoe UI" w:cs="Segoe UI"/>
+                <w:color w:val="000000"/>
+                <w:sz w:val="18"/>
+              </w:rPr>
+              <w:t>ps.github.io</w:t>
             </w:r>
             <w:r>
               <w:rPr>
@@ -873,7 +929,47 @@
                 <w:color w:val="000000"/>
                 <w:sz w:val="18"/>
               </w:rPr>
-              <w:t>www.youtube.com/@shivaops-h5j</w:t>
+              <w:t>www.youtube.com/@</w:t>
+            </w:r>
+            <w:r>
+              <w:rPr>
+                <w:rFonts w:ascii="Segoe UI" w:eastAsia="Segoe UI" w:hAnsi="Segoe UI" w:cs="Segoe UI"/>
+                <w:color w:val="000000"/>
+                <w:sz w:val="18"/>
+              </w:rPr>
+              <w:t>S</w:t>
+            </w:r>
+            <w:r>
+              <w:rPr>
+                <w:rFonts w:ascii="Segoe UI" w:eastAsia="Segoe UI" w:hAnsi="Segoe UI" w:cs="Segoe UI"/>
+                <w:color w:val="000000"/>
+                <w:sz w:val="18"/>
+              </w:rPr>
+              <w:t>hiva</w:t>
+            </w:r>
+            <w:r>
+              <w:rPr>
+                <w:rFonts w:ascii="Segoe UI" w:eastAsia="Segoe UI" w:hAnsi="Segoe UI" w:cs="Segoe UI"/>
+                <w:color w:val="000000"/>
+                <w:sz w:val="18"/>
+              </w:rPr>
+              <w:t>O</w:t>
+            </w:r>
+            <w:r>
+              <w:rPr>
+                <w:rFonts w:ascii="Segoe UI" w:eastAsia="Segoe UI" w:hAnsi="Segoe UI" w:cs="Segoe UI"/>
+                <w:color w:val="000000"/>
+                <w:sz w:val="18"/>
+              </w:rPr>
+              <w:t>ps-</w:t>
+            </w:r>
+            <w:r>
+              <w:rPr>
+                <w:rFonts w:ascii="Segoe UI" w:eastAsia="Segoe UI" w:hAnsi="Segoe UI" w:cs="Segoe UI"/>
+                <w:color w:val="000000"/>
+                <w:sz w:val="18"/>
+              </w:rPr>
+              <w:t>AI</w:t>
             </w:r>
           </w:p>
           <w:p>
@@ -8497,6 +8593,7 @@
   <w:rsids>
     <w:rsidRoot w:val="00AD01EA"/>
     <w:rsid w:val="00047DB2"/>
+    <w:rsid w:val="00183E0F"/>
     <w:rsid w:val="001918A6"/>
     <w:rsid w:val="00202108"/>
     <w:rsid w:val="002A3815"/>
@@ -8510,6 +8607,7 @@
     <w:rsid w:val="00A03874"/>
     <w:rsid w:val="00AD01EA"/>
     <w:rsid w:val="00B03182"/>
+    <w:rsid w:val="00C017C2"/>
     <w:rsid w:val="00CC54EF"/>
     <w:rsid w:val="00F672FA"/>
   </w:rsids>
@@ -9325,12 +9423,7 @@
 </file>
 
 <file path=customXml/item1.xml><?xml version="1.0" encoding="utf-8"?>
-<?mso-contentType ?>
-<FormTemplates xmlns="http://schemas.microsoft.com/sharepoint/v3/contenttype/forms">
-  <Display>DocumentLibraryForm</Display>
-  <Edit>DocumentLibraryForm</Edit>
-  <New>DocumentLibraryForm</New>
-</FormTemplates>
+<b:Sources xmlns:b="http://schemas.openxmlformats.org/officeDocument/2006/bibliography" xmlns="http://schemas.openxmlformats.org/officeDocument/2006/bibliography" SelectedStyle="\APASixthEditionOfficeOnline.xsl" StyleName="APA" Version="6"/>
 </file>
 
 <file path=customXml/item2.xml><?xml version="1.0" encoding="utf-8"?>
@@ -9646,7 +9739,12 @@
 </file>
 
 <file path=customXml/item3.xml><?xml version="1.0" encoding="utf-8"?>
-<b:Sources xmlns:b="http://schemas.openxmlformats.org/officeDocument/2006/bibliography" xmlns="http://schemas.openxmlformats.org/officeDocument/2006/bibliography" SelectedStyle="\APASixthEditionOfficeOnline.xsl" StyleName="APA" Version="6"/>
+<?mso-contentType ?>
+<FormTemplates xmlns="http://schemas.microsoft.com/sharepoint/v3/contenttype/forms">
+  <Display>DocumentLibraryForm</Display>
+  <Edit>DocumentLibraryForm</Edit>
+  <New>DocumentLibraryForm</New>
+</FormTemplates>
 </file>
 
 <file path=customXml/item4.xml><?xml version="1.0" encoding="utf-8"?>
@@ -9670,9 +9768,9 @@
 </file>
 
 <file path=customXml/itemProps1.xml><?xml version="1.0" encoding="utf-8"?>
-<ds:datastoreItem xmlns:ds="http://schemas.openxmlformats.org/officeDocument/2006/customXml" ds:itemID="{2D5CED70-FA13-46C4-A102-29F5645502CE}">
+<ds:datastoreItem xmlns:ds="http://schemas.openxmlformats.org/officeDocument/2006/customXml" ds:itemID="{81F788BB-310B-43D7-B9F5-95A6C7D991AA}">
   <ds:schemaRefs>
-    <ds:schemaRef ds:uri="http://schemas.microsoft.com/sharepoint/v3/contenttype/forms"/>
+    <ds:schemaRef ds:uri="http://schemas.openxmlformats.org/officeDocument/2006/bibliography"/>
   </ds:schemaRefs>
 </ds:datastoreItem>
 </file>
@@ -9699,9 +9797,9 @@
 </file>
 
 <file path=customXml/itemProps3.xml><?xml version="1.0" encoding="utf-8"?>
-<ds:datastoreItem xmlns:ds="http://schemas.openxmlformats.org/officeDocument/2006/customXml" ds:itemID="{81F788BB-310B-43D7-B9F5-95A6C7D991AA}">
+<ds:datastoreItem xmlns:ds="http://schemas.openxmlformats.org/officeDocument/2006/customXml" ds:itemID="{2D5CED70-FA13-46C4-A102-29F5645502CE}">
   <ds:schemaRefs>
-    <ds:schemaRef ds:uri="http://schemas.openxmlformats.org/officeDocument/2006/bibliography"/>
+    <ds:schemaRef ds:uri="http://schemas.microsoft.com/sharepoint/v3/contenttype/forms"/>
   </ds:schemaRefs>
 </ds:datastoreItem>
 </file>

</xml_diff>